<commit_message>
Blank blueprint: panels and links coloured as the wizard colours them; the guide rewritten in plain language
Dropdowns lavender, callouts blue, the gold callout in the composite's warm
colours, internal links underlined in link blue, the key at the top showing
each in its colour; Week 1's overview carries a dropdown, a blue callout, a
gold callout, and a link as worked examples. The opening guide now says, in
plain and specific words, what the document is, what to do in order, how to
read what is already on the page, and four rules that save a round of fixes.
Nothing about reading or building changed. Version 0.2.2.
</commit_message>
<xml_diff>
--- a/docs/examples/blank_blueprint__8_weeks.docx
+++ b/docs/examples/blank_blueprint__8_weeks.docx
@@ -29,7 +29,7 @@
           <w:color w:val="174B5C"/>
           <w:sz w:val="24"/>
         </w:rPr>
-        <w:t>How to use this document</w:t>
+        <w:t>What this document is</w:t>
       </w:r>
     </w:p>
     <w:p>
@@ -38,7 +38,69 @@
         <w:spacing w:after="60"/>
       </w:pPr>
       <w:r>
-        <w:t>This is a course blueprint: one Word file that a tool turns into a complete Brightspace course. Write in it as you would any document; the structure comes from a few plain lines, listed in the key below.</w:t>
+        <w:t>This Word file is the whole plan for one course. When it is finished, a tool reads it and builds the Brightspace course from it: the weekly pages, assignments, discussions, checklists, rubrics, and gradebook. You only write here.</w:t>
+      </w:r>
+    </w:p>
+    <w:p>
+      <w:pPr>
+        <w:spacing w:before="200" w:after="80"/>
+      </w:pPr>
+      <w:r>
+        <w:rPr>
+          <w:b/>
+          <w:color w:val="174B5C"/>
+          <w:sz w:val="24"/>
+        </w:rPr>
+        <w:t>What to do, in order</w:t>
+      </w:r>
+    </w:p>
+    <w:p>
+      <w:pPr>
+        <w:pStyle w:val="ListNumber"/>
+        <w:spacing w:after="60"/>
+      </w:pPr>
+      <w:r>
+        <w:t>At the top, fill the three shaded boxes (catalog description, required materials, learning outcomes) and the points table.</w:t>
+      </w:r>
+    </w:p>
+    <w:p>
+      <w:pPr>
+        <w:pStyle w:val="ListNumber"/>
+        <w:spacing w:after="60"/>
+      </w:pPr>
+      <w:r>
+        <w:t>For each week, write in the six rows of its table: the overview page, the learning objectives, the readings and media, the assignments, the discussions, and the checklist.</w:t>
+      </w:r>
+    </w:p>
+    <w:p>
+      <w:pPr>
+        <w:pStyle w:val="ListNumber"/>
+        <w:spacing w:after="60"/>
+      </w:pPr>
+      <w:r>
+        <w:t>At the end, under Rubric Appendix, give each rubric its name and fill in its table. Two standard rubrics are already there to adapt.</w:t>
+      </w:r>
+    </w:p>
+    <w:p>
+      <w:pPr>
+        <w:pStyle w:val="ListNumber"/>
+        <w:spacing w:after="60"/>
+      </w:pPr>
+      <w:r>
+        <w:t>When you are done, save the file and hand it back. The build happens from this file as it is.</w:t>
+      </w:r>
+    </w:p>
+    <w:p>
+      <w:pPr>
+        <w:spacing w:before="200" w:after="80"/>
+      </w:pPr>
+      <w:r>
+        <w:rPr>
+          <w:b/>
+          <w:color w:val="174B5C"/>
+          <w:sz w:val="24"/>
+        </w:rPr>
+        <w:t>How to read what is already on the page</w:t>
       </w:r>
     </w:p>
     <w:p>
@@ -47,7 +109,7 @@
         <w:spacing w:after="60"/>
       </w:pPr>
       <w:r>
-        <w:t>Each week is one table with six rows. Fill the rows in order; leave a row's prompt in place if you have nothing for it yet.</w:t>
+        <w:t>A line in bold navy with a colon (Assignment:, Points:, Rubric:, Page heading:) is an instruction to the builder. Keep the word before the colon exactly as it is; change what comes after it. For example, Assignment: Week 2 Assignment: (title) becomes Assignment: Week 2 Assignment: Market Analysis Memo.</w:t>
       </w:r>
     </w:p>
     <w:p>
@@ -56,7 +118,7 @@
         <w:spacing w:after="60"/>
       </w:pPr>
       <w:r>
-        <w:t>Headings are one to one with the page. The big Heading 1 lines are the frame and are already in place; inside a page or an activity, start at Heading 2.</w:t>
+        <w:t>Grey italic text in parentheses, like (Introduce the week here), tells you what belongs in that spot. Replace it with your text, or delete it.</w:t>
       </w:r>
     </w:p>
     <w:p>
@@ -65,7 +127,7 @@
         <w:spacing w:after="60"/>
       </w:pPr>
       <w:r>
-        <w:t>Real bullets, real numbering, bold and italic all come through. Never type dates; say the day of the week and the build adds the term's dates.</w:t>
+        <w:t>The large Heading 1 lines (Course Introduction, Week 1 – …, Rubric Appendix) are the document's skeleton. Leave them where they are; you may change a week's title after its dash.</w:t>
       </w:r>
     </w:p>
     <w:p>
@@ -74,7 +136,7 @@
         <w:spacing w:after="60"/>
       </w:pPr>
       <w:r>
-        <w:t>Grey italic text in parentheses is a prompt. Replace it or delete it. Upright text is structure: keep its shape and change its words.</w:t>
+        <w:t>Shaded blocks are panels: a lavender block is a dropdown the student opens, a blue block is a callout, a warm block is a callout for something to keep in mind. The bracket lines at their top and bottom mark where they start and end; write between them.</w:t>
       </w:r>
     </w:p>
     <w:p>
@@ -83,7 +145,56 @@
         <w:spacing w:after="60"/>
       </w:pPr>
       <w:r>
-        <w:t>These notes at the top are kept with the document but never built into the course; delete them whenever you like.</w:t>
+        <w:t>Underlined blue [link to …] text becomes a working link to another part of the course.</w:t>
+      </w:r>
+    </w:p>
+    <w:p>
+      <w:pPr>
+        <w:spacing w:before="200" w:after="80"/>
+      </w:pPr>
+      <w:r>
+        <w:rPr>
+          <w:b/>
+          <w:color w:val="174B5C"/>
+          <w:sz w:val="24"/>
+        </w:rPr>
+        <w:t>Four rules that save a round of fixes</w:t>
+      </w:r>
+    </w:p>
+    <w:p>
+      <w:pPr>
+        <w:pStyle w:val="ListBullet"/>
+        <w:spacing w:after="60"/>
+      </w:pPr>
+      <w:r>
+        <w:t>Use Word's own bullets, numbering, bold, italic, and links; they all come through. Inside a page or an assignment, start your own headings at Heading 2.</w:t>
+      </w:r>
+    </w:p>
+    <w:p>
+      <w:pPr>
+        <w:pStyle w:val="ListBullet"/>
+        <w:spacing w:after="60"/>
+      </w:pPr>
+      <w:r>
+        <w:t>Never type a calendar date. Write 'due Sunday' or 'post by Friday'; the dates for each term are added when the course is built.</w:t>
+      </w:r>
+    </w:p>
+    <w:p>
+      <w:pPr>
+        <w:pStyle w:val="ListBullet"/>
+        <w:spacing w:after="60"/>
+      </w:pPr>
+      <w:r>
+        <w:t>Names must match. The title on an Assignment line, its Gradebook item line, and its row in the points table are the same words, and the points agree.</w:t>
+      </w:r>
+    </w:p>
+    <w:p>
+      <w:pPr>
+        <w:pStyle w:val="ListBullet"/>
+        <w:spacing w:after="60"/>
+      </w:pPr>
+      <w:r>
+        <w:t>You may delete this guide and the key below once you know the layout; the builder never reads them.</w:t>
       </w:r>
     </w:p>
     <w:p>
@@ -112,7 +223,7 @@
         <w:t>Page: Title  /  Page heading: Title</w:t>
       </w:r>
       <w:r>
-        <w:t xml:space="preserve"> — a content page and the title shown on it.</w:t>
+        <w:t xml:space="preserve"> — a content page and the title shown at its top.</w:t>
       </w:r>
     </w:p>
     <w:p>
@@ -128,7 +239,7 @@
         <w:t>Placement: Module name</w:t>
       </w:r>
       <w:r>
-        <w:t xml:space="preserve"> — where a page goes when it is not in its week.</w:t>
+        <w:t xml:space="preserve"> — where a page goes when it is not part of its week.</w:t>
       </w:r>
     </w:p>
     <w:p>
@@ -144,7 +255,7 @@
         <w:t>Assignment: Title  /  Discussion: Title</w:t>
       </w:r>
       <w:r>
-        <w:t xml:space="preserve"> — an activity. Under it: Points: N pts, Gradebook item: Name, Rubric: Name, and for a discussion Forum: Name.</w:t>
+        <w:t xml:space="preserve"> — an activity. Under it: Points: 10 pts, Gradebook item: Title, Rubric: Rubric name, and for a discussion Forum: Discussions.</w:t>
       </w:r>
     </w:p>
     <w:p>
@@ -160,7 +271,7 @@
         <w:t>Checklist: Title</w:t>
       </w:r>
       <w:r>
-        <w:t xml:space="preserve"> — a week's checklist; the line Items: From this week's activities builds it, or type the items.</w:t>
+        <w:t xml:space="preserve"> — the week's checklist. The line Items: From this week's activities builds it from the week's activities; or type the items yourself, one per line.</w:t>
       </w:r>
     </w:p>
     <w:p>
@@ -176,7 +287,7 @@
         <w:t>Module: Name</w:t>
       </w:r>
       <w:r>
-        <w:t xml:space="preserve"> — before Week 1, a module of its own; its pages and links follow on the lines below.</w:t>
+        <w:t xml:space="preserve"> — before Week 1, a module of its own; its pages and links follow on the lines below it.</w:t>
       </w:r>
     </w:p>
     <w:p>
@@ -192,7 +303,7 @@
         <w:t>Link: Title  /  URL: https://…</w:t>
       </w:r>
       <w:r>
-        <w:t xml:space="preserve"> — an external link in a module.</w:t>
+        <w:t xml:space="preserve"> — an external link placed in a module.</w:t>
       </w:r>
     </w:p>
     <w:p>
@@ -208,7 +319,58 @@
         <w:t>Used by: Assignment: Title</w:t>
       </w:r>
       <w:r>
-        <w:t xml:space="preserve"> — under a rubric, each activity that uses it.</w:t>
+        <w:t xml:space="preserve"> — under a rubric, one line for each activity that uses it.</w:t>
+      </w:r>
+    </w:p>
+    <w:p>
+      <w:pPr>
+        <w:pStyle w:val="ListBullet"/>
+        <w:spacing w:after="60"/>
+        <w:shd w:val="clear" w:color="auto" w:fill="F4F2FA"/>
+      </w:pPr>
+      <w:r>
+        <w:rPr>
+          <w:b/>
+          <w:color w:val="5B3A8C"/>
+        </w:rPr>
+        <w:t>[dropdown: Title] … [/dropdown]</w:t>
+      </w:r>
+      <w:r>
+        <w:t xml:space="preserve"> — a panel the student clicks open. Shaded lavender.</w:t>
+      </w:r>
+    </w:p>
+    <w:p>
+      <w:pPr>
+        <w:pStyle w:val="ListBullet"/>
+        <w:spacing w:after="60"/>
+        <w:shd w:val="clear" w:color="auto" w:fill="F2F6FA"/>
+      </w:pPr>
+      <w:r>
+        <w:rPr>
+          <w:b/>
+          <w:color w:val="103945"/>
+        </w:rPr>
+        <w:t>[callout] … [/callout]</w:t>
+      </w:r>
+      <w:r>
+        <w:t xml:space="preserve"> — a highlighted box. Shaded blue. [callout tone=gold] … [/callout] — the warm version, for something to keep in mind.</w:t>
+      </w:r>
+    </w:p>
+    <w:p>
+      <w:pPr>
+        <w:pStyle w:val="ListBullet"/>
+        <w:spacing w:after="60"/>
+        <w:shd w:val="clear" w:color="auto" w:fill="F2F6FA"/>
+      </w:pPr>
+      <w:r>
+        <w:rPr>
+          <w:b/>
+          <w:color w:val="103945"/>
+        </w:rPr>
+        <w:t>[timeline] … [/timeline]</w:t>
+      </w:r>
+      <w:r>
+        <w:t xml:space="preserve"> — a sequence of stages; [box] … [/box] — a plain framed section.</w:t>
       </w:r>
     </w:p>
     <w:p>
@@ -219,28 +381,13 @@
       <w:r>
         <w:rPr>
           <w:b/>
-          <w:color w:val="103945"/>
-        </w:rPr>
-        <w:t>[dropdown: Title] … [/dropdown]</w:t>
-      </w:r>
-      <w:r>
-        <w:t xml:space="preserve"> — an expandable panel.  [callout] … [/callout] — a highlighted box; [callout tone=gold] for a warm one.  [timeline] … [/timeline] and [box] … [/box] are also available.</w:t>
-      </w:r>
-    </w:p>
-    <w:p>
-      <w:pPr>
-        <w:pStyle w:val="ListBullet"/>
-        <w:spacing w:after="60"/>
-      </w:pPr>
-      <w:r>
-        <w:rPr>
-          <w:b/>
-          <w:color w:val="103945"/>
+          <w:color w:val="075F7A"/>
+          <w:u w:val="single"/>
         </w:rPr>
         <w:t>[link to assignment: Title | words]</w:t>
       </w:r>
       <w:r>
-        <w:t xml:space="preserve"> — a link to the course's own object; also link to discussion, quiz, checklist, or page. The words after the bar are what the reader clicks.</w:t>
+        <w:t xml:space="preserve"> — a link to the course's own object. Also link to discussion, link to quiz, link to checklist, link to page. The words after the bar are what the reader sees and clicks; without them, the title is shown.</w:t>
       </w:r>
     </w:p>
     <w:p>
@@ -509,13 +656,13 @@
         <w:tc>
           <w:tcPr>
             <w:tcW w:type="dxa" w:w="4680"/>
-            <w:shd w:val="clear" w:color="auto" w:fill="174B5C"/>
+            <w:shd w:val="clear" w:color="auto" w:fill="EDF4F6"/>
           </w:tcPr>
           <w:p>
             <w:r>
               <w:rPr>
                 <w:b/>
-                <w:color w:val="FFFFFF"/>
+                <w:color w:val="103945"/>
               </w:rPr>
               <w:t>Assignment</w:t>
             </w:r>
@@ -524,13 +671,13 @@
         <w:tc>
           <w:tcPr>
             <w:tcW w:type="dxa" w:w="4680"/>
-            <w:shd w:val="clear" w:color="auto" w:fill="174B5C"/>
+            <w:shd w:val="clear" w:color="auto" w:fill="EDF4F6"/>
           </w:tcPr>
           <w:p>
             <w:r>
               <w:rPr>
                 <w:b/>
-                <w:color w:val="FFFFFF"/>
+                <w:color w:val="103945"/>
               </w:rPr>
               <w:t>Points</w:t>
             </w:r>
@@ -1274,7 +1421,124 @@
                 <w:i/>
                 <w:color w:val="5B6B72"/>
               </w:rPr>
-              <w:t>(Introduce the week here. The three examples below are real: keep, change, or delete them.)</w:t>
+              <w:t>(Introduce the week here. The four examples below are real: keep, change, or delete them.)</w:t>
+            </w:r>
+          </w:p>
+          <w:p>
+            <w:pPr>
+              <w:spacing w:after="80"/>
+              <w:shd w:val="clear" w:color="auto" w:fill="F4F2FA"/>
+            </w:pPr>
+            <w:r>
+              <w:rPr>
+                <w:b/>
+                <w:color w:val="5B3A8C"/>
+              </w:rPr>
+              <w:t>[dropdown: Example dropdown – a panel the reader opens]</w:t>
+            </w:r>
+          </w:p>
+          <w:p>
+            <w:pPr>
+              <w:spacing w:after="80"/>
+              <w:shd w:val="clear" w:color="auto" w:fill="F4F2FA"/>
+            </w:pPr>
+            <w:r>
+              <w:rPr>
+                <w:i/>
+                <w:color w:val="5B6B72"/>
+              </w:rPr>
+              <w:t>(Anything between the bracket lines is inside the panel: paragraphs, bullets, links.)</w:t>
+            </w:r>
+          </w:p>
+          <w:p>
+            <w:pPr>
+              <w:spacing w:after="80"/>
+              <w:shd w:val="clear" w:color="auto" w:fill="F4F2FA"/>
+            </w:pPr>
+            <w:r>
+              <w:rPr>
+                <w:b/>
+                <w:color w:val="5B3A8C"/>
+              </w:rPr>
+              <w:t>[/dropdown]</w:t>
+            </w:r>
+          </w:p>
+          <w:p>
+            <w:pPr>
+              <w:spacing w:after="80"/>
+              <w:shd w:val="clear" w:color="auto" w:fill="F2F6FA"/>
+            </w:pPr>
+            <w:r>
+              <w:rPr>
+                <w:b/>
+                <w:color w:val="103945"/>
+              </w:rPr>
+              <w:t>[callout]</w:t>
+            </w:r>
+          </w:p>
+          <w:p>
+            <w:pPr>
+              <w:spacing w:after="80"/>
+              <w:shd w:val="clear" w:color="auto" w:fill="F2F6FA"/>
+            </w:pPr>
+            <w:r>
+              <w:rPr>
+                <w:i/>
+                <w:color w:val="5B6B72"/>
+              </w:rPr>
+              <w:t>(A callout: a highlighted box for a note, a reminder, or a short aside. Shaded blue on the page.)</w:t>
+            </w:r>
+          </w:p>
+          <w:p>
+            <w:pPr>
+              <w:spacing w:after="80"/>
+              <w:shd w:val="clear" w:color="auto" w:fill="F2F6FA"/>
+            </w:pPr>
+            <w:r>
+              <w:rPr>
+                <w:b/>
+                <w:color w:val="103945"/>
+              </w:rPr>
+              <w:t>[/callout]</w:t>
+            </w:r>
+          </w:p>
+          <w:p>
+            <w:pPr>
+              <w:spacing w:after="80"/>
+              <w:shd w:val="clear" w:color="auto" w:fill="FBF1E9"/>
+            </w:pPr>
+            <w:r>
+              <w:rPr>
+                <w:b/>
+                <w:color w:val="8B4A27"/>
+              </w:rPr>
+              <w:t>[callout tone=gold]</w:t>
+            </w:r>
+          </w:p>
+          <w:p>
+            <w:pPr>
+              <w:spacing w:after="80"/>
+              <w:shd w:val="clear" w:color="auto" w:fill="FBF1E9"/>
+            </w:pPr>
+            <w:r>
+              <w:rPr>
+                <w:i/>
+                <w:color w:val="5B6B72"/>
+              </w:rPr>
+              <w:t>(The warm callout, for something to keep in mind. The tone word is the only difference.)</w:t>
+            </w:r>
+          </w:p>
+          <w:p>
+            <w:pPr>
+              <w:spacing w:after="80"/>
+              <w:shd w:val="clear" w:color="auto" w:fill="FBF1E9"/>
+            </w:pPr>
+            <w:r>
+              <w:rPr>
+                <w:b/>
+                <w:color w:val="8B4A27"/>
+              </w:rPr>
+              <w:t>[/callout]</w:t>
             </w:r>
           </w:p>
           <w:p>
@@ -1283,85 +1547,23 @@
             </w:pPr>
             <w:r>
               <w:rPr>
-                <w:b/>
-                <w:color w:val="174B5C"/>
-              </w:rPr>
-              <w:t>[dropdown: Example dropdown – a panel the reader opens]</w:t>
-            </w:r>
-          </w:p>
-          <w:p>
-            <w:pPr>
-              <w:spacing w:after="80"/>
-            </w:pPr>
-            <w:r>
-              <w:rPr>
-                <w:i/>
-                <w:color w:val="5B6B72"/>
-              </w:rPr>
-              <w:t>(Anything between the bracket lines is inside the panel: paragraphs, bullets, links.)</w:t>
-            </w:r>
-          </w:p>
-          <w:p>
-            <w:pPr>
-              <w:spacing w:after="80"/>
-            </w:pPr>
-            <w:r>
-              <w:rPr>
-                <w:b/>
-                <w:color w:val="174B5C"/>
-              </w:rPr>
-              <w:t>[/dropdown]</w:t>
-            </w:r>
-          </w:p>
-          <w:p>
-            <w:pPr>
-              <w:spacing w:after="80"/>
-            </w:pPr>
-            <w:r>
-              <w:rPr>
-                <w:b/>
-                <w:color w:val="174B5C"/>
-              </w:rPr>
-              <w:t>[callout tone=gold]</w:t>
-            </w:r>
-          </w:p>
-          <w:p>
-            <w:pPr>
-              <w:spacing w:after="80"/>
-            </w:pPr>
-            <w:r>
-              <w:rPr>
-                <w:i/>
-                <w:color w:val="5B6B72"/>
-              </w:rPr>
-              <w:t>(A callout for something to keep in mind. Leave out tone=gold for the plain navy callout.)</w:t>
-            </w:r>
-          </w:p>
-          <w:p>
-            <w:pPr>
-              <w:spacing w:after="80"/>
-            </w:pPr>
-            <w:r>
-              <w:rPr>
-                <w:b/>
-                <w:color w:val="174B5C"/>
-              </w:rPr>
-              <w:t>[/callout]</w:t>
-            </w:r>
-          </w:p>
-          <w:p>
-            <w:pPr>
-              <w:spacing w:after="80"/>
-            </w:pPr>
-            <w:r>
-              <w:rPr>
                 <w:i/>
                 <w:color w:val="5B6B72"/>
               </w:rPr>
               <w:t>(An internal link reads like this:)</w:t>
             </w:r>
             <w:r>
-              <w:t xml:space="preserve"> Start with the [link to assignment: Week 1 Assignment: (title) | first assignment] before the discussion.</w:t>
+              <w:t xml:space="preserve"> Start with the </w:t>
+            </w:r>
+            <w:r>
+              <w:rPr>
+                <w:color w:val="075F7A"/>
+                <w:u w:val="single"/>
+              </w:rPr>
+              <w:t>[link to assignment: Week 1 Assignment: (title) | first assignment]</w:t>
+            </w:r>
+            <w:r>
+              <w:t xml:space="preserve"> before the discussion.</w:t>
             </w:r>
           </w:p>
         </w:tc>

</xml_diff>